<commit_message>
feat(minnctapp): petition-for-writ cross_engine gate: the model's URL rule breaks footnote 3 alike in every engine; engines regenerated (fb-595.54.60)
Co-Authored-By: Claude Opus 5.5 <noreply@anthropic.com>
</commit_message>
<xml_diff>
--- a/courts/eighth-circuit/minnesota/state/court-of-appeals/petition-for-writ/usage/OUTPUT-petition-for-writ.docx
+++ b/courts/eighth-circuit/minnesota/state/court-of-appeals/petition-for-writ/usage/OUTPUT-petition-for-writ.docx
@@ -1748,7 +1748,7 @@
         <w:pStyle w:val="BodyText"/>
       </w:pPr>
       <w:r>
-        <w:t xml:space="preserve">Relying on the First Amendment, the Court categorically rejected this claim, ruling that when “a newspaper lawfully obtains truthful information about a matter of public significance [ ] state officials may not constitutionally punish publication of the information, absent a need … of the highest order.”</w:t>
+        <w:t xml:space="preserve">Relying on the First Amendment, the Court categorically rejected this claim, ruling that when “a newspaper lawfully obtains truthful information about a matter of public significance [ ] state officials may not constitutionally punish publication of the information, absent a need … of the highest order.”</w:t>
       </w:r>
       <w:r>
         <w:t xml:space="preserve"> </w:t>
@@ -2526,13 +2526,13 @@
         <w:t xml:space="preserve"> </w:t>
       </w:r>
       <w:r>
-        <w:t xml:space="preserve">See https://www.dailymail.co.uk/​news/​article</w:t>
+        <w:t xml:space="preserve">See https://​www.​dailymail.​co.​uk/​news/​article</w:t>
       </w:r>
       <w:r>
         <w:noBreakHyphen/>
       </w:r>
       <w:r>
-        <w:t xml:space="preserve">8576371/​Police-bodycam-footage-shows-moment-moment-arrest-George-Floyd-time.html.</w:t>
+        <w:t xml:space="preserve">8576371/​Police-​bodycam-​footage-​shows-​moment-​moment-​arrest-​George-​Floyd-​time.​html.</w:t>
       </w:r>
     </w:p>
   </w:footnote>
@@ -2551,7 +2551,7 @@
         <w:t xml:space="preserve"> </w:t>
       </w:r>
       <w:r>
-        <w:t xml:space="preserve">See https://www.mncourts.gov/​mncourtsgov/​media/​High-Profile-Cases/27-CR</w:t>
+        <w:t xml:space="preserve">See https://​www.​mncourts.​gov/​mncourtsgov/​media/​High-​Profile-​Cases/​27-​CR</w:t>
       </w:r>
       <w:r>
         <w:noBreakHyphen/>
@@ -2563,7 +2563,7 @@
         <w:noBreakHyphen/>
       </w:r>
       <w:r>
-        <w:t xml:space="preserve">12951-TKL/​Memorandum08112020.pdf</w:t>
+        <w:t xml:space="preserve">12951-​TKL/​Memorandum08112020.​pdf</w:t>
       </w:r>
     </w:p>
   </w:footnote>
@@ -3221,6 +3221,7 @@
     <w:unhideWhenUsed/>
     <w:qFormat/>
     <w:pPr>
+      <w:keepLines/>
       <w:spacing w:before="0" w:after="140" w:line="299" w:lineRule="exact"/>
     </w:pPr>
     <w:rPr>
@@ -3471,6 +3472,33 @@
     <w:pPr>
       <w:spacing w:before="0" w:after="0" w:line="299" w:lineRule="exact"/>
       <w:ind w:left="2160" w:hanging="720"/>
+    </w:pPr>
+  </w:style>
+  <w:style w:type="paragraph" w:customStyle="1" w:styleId="XdQuoteList1">
+    <w:name w:val="Xd Quote List 1"/>
+    <w:basedOn w:val="Normal"/>
+    <w:qFormat/>
+    <w:pPr>
+      <w:spacing w:before="0" w:after="0" w:line="299" w:lineRule="exact"/>
+      <w:ind w:left="1440" w:right="720" w:hanging="720"/>
+    </w:pPr>
+  </w:style>
+  <w:style w:type="paragraph" w:customStyle="1" w:styleId="XdQuoteList2">
+    <w:name w:val="Xd Quote List 2"/>
+    <w:basedOn w:val="Normal"/>
+    <w:qFormat/>
+    <w:pPr>
+      <w:spacing w:before="0" w:after="0" w:line="299" w:lineRule="exact"/>
+      <w:ind w:left="2160" w:right="720" w:hanging="720"/>
+    </w:pPr>
+  </w:style>
+  <w:style w:type="paragraph" w:customStyle="1" w:styleId="XdQuoteList3">
+    <w:name w:val="Xd Quote List 3"/>
+    <w:basedOn w:val="Normal"/>
+    <w:qFormat/>
+    <w:pPr>
+      <w:spacing w:before="0" w:after="0" w:line="299" w:lineRule="exact"/>
+      <w:ind w:left="2880" w:right="720" w:hanging="720"/>
     </w:pPr>
   </w:style>
   <w:style w:type="paragraph" w:customStyle="1" w:styleId="XdQuoteFirst">

</xml_diff>